<commit_message>
approval system ,, email for usertname remaining
</commit_message>
<xml_diff>
--- a/assets/template.docx
+++ b/assets/template.docx
@@ -1,6 +1,6 @@
 
 <file path=word/document.xml><?xml version="1.0" encoding="utf-8"?>
-<w:document xmlns:wpc="http://schemas.microsoft.com/office/word/2010/wordprocessingCanvas" xmlns:cx="http://schemas.microsoft.com/office/drawing/2014/chartex" xmlns:cx1="http://schemas.microsoft.com/office/drawing/2015/9/8/chartex" xmlns:cx2="http://schemas.microsoft.com/office/drawing/2015/10/21/chartex" xmlns:cx3="http://schemas.microsoft.com/office/drawing/2016/5/9/chartex" xmlns:cx4="http://schemas.microsoft.com/office/drawing/2016/5/10/chartex" xmlns:cx5="http://schemas.microsoft.com/office/drawing/2016/5/11/chartex" xmlns:cx6="http://schemas.microsoft.com/office/drawing/2016/5/12/chartex" xmlns:cx7="http://schemas.microsoft.com/office/drawing/2016/5/13/chartex" xmlns:cx8="http://schemas.microsoft.com/office/drawing/2016/5/14/chartex" xmlns:mc="http://schemas.openxmlformats.org/markup-compatibility/2006" xmlns:aink="http://schemas.microsoft.com/office/drawing/2016/ink" xmlns:am3d="http://schemas.microsoft.com/office/drawing/2017/model3d" xmlns:o="urn:schemas-microsoft-com:office:office" xmlns:oel="http://schemas.microsoft.com/office/2019/extlst" xmlns:r="http://schemas.openxmlformats.org/officeDocument/2006/relationships" xmlns:m="http://schemas.openxmlformats.org/officeDocument/2006/math" xmlns:v="urn:schemas-microsoft-com:vml" xmlns:wp14="http://schemas.microsoft.com/office/word/2010/wordprocessingDrawing" xmlns:wp="http://schemas.openxmlformats.org/drawingml/2006/wordprocessingDrawing" xmlns:w10="urn:schemas-microsoft-com:office:word" xmlns:w="http://schemas.openxmlformats.org/wordprocessingml/2006/main" xmlns:w14="http://schemas.microsoft.com/office/word/2010/wordml" xmlns:w15="http://schemas.microsoft.com/office/word/2012/wordml" xmlns:w16cei="http://schemas.microsoft.com/office/word/2026/wordml/cei" xmlns:w16cex="http://schemas.microsoft.com/office/word/2018/wordml/cex" xmlns:w16cid="http://schemas.microsoft.com/office/word/2016/wordml/cid" xmlns:w16="http://schemas.microsoft.com/office/word/2018/wordml" xmlns:w16du="http://schemas.microsoft.com/office/word/2023/wordml/word16du" xmlns:w16sdtdh="http://schemas.microsoft.com/office/word/2020/wordml/sdtdatahash" xmlns:w16sdtfl="http://schemas.microsoft.com/office/word/2024/wordml/sdtformatlock" xmlns:w16se="http://schemas.microsoft.com/office/word/2015/wordml/symex" xmlns:wpg="http://schemas.microsoft.com/office/word/2010/wordprocessingGroup" xmlns:wpi="http://schemas.microsoft.com/office/word/2010/wordprocessingInk" xmlns:wne="http://schemas.microsoft.com/office/word/2006/wordml" xmlns:wps="http://schemas.microsoft.com/office/word/2010/wordprocessingShape" mc:Ignorable="w14 w15 w16se w16cid w16 w16cex w16sdtdh w16sdtfl w16du wp14">
+<w:document xmlns:wpc="http://schemas.microsoft.com/office/word/2010/wordprocessingCanvas" xmlns:cx="http://schemas.microsoft.com/office/drawing/2014/chartex" xmlns:cx1="http://schemas.microsoft.com/office/drawing/2015/9/8/chartex" xmlns:cx2="http://schemas.microsoft.com/office/drawing/2015/10/21/chartex" xmlns:cx3="http://schemas.microsoft.com/office/drawing/2016/5/9/chartex" xmlns:cx4="http://schemas.microsoft.com/office/drawing/2016/5/10/chartex" xmlns:cx5="http://schemas.microsoft.com/office/drawing/2016/5/11/chartex" xmlns:cx6="http://schemas.microsoft.com/office/drawing/2016/5/12/chartex" xmlns:cx7="http://schemas.microsoft.com/office/drawing/2016/5/13/chartex" xmlns:cx8="http://schemas.microsoft.com/office/drawing/2016/5/14/chartex" xmlns:mc="http://schemas.openxmlformats.org/markup-compatibility/2006" xmlns:aink="http://schemas.microsoft.com/office/drawing/2016/ink" xmlns:am3d="http://schemas.microsoft.com/office/drawing/2017/model3d" xmlns:o="urn:schemas-microsoft-com:office:office" xmlns:oel="http://schemas.microsoft.com/office/2019/extlst" xmlns:r="http://schemas.openxmlformats.org/officeDocument/2006/relationships" xmlns:m="http://schemas.openxmlformats.org/officeDocument/2006/math" xmlns:v="urn:schemas-microsoft-com:vml" xmlns:wp14="http://schemas.microsoft.com/office/word/2010/wordprocessingDrawing" xmlns:wp="http://schemas.openxmlformats.org/drawingml/2006/wordprocessingDrawing" xmlns:w10="urn:schemas-microsoft-com:office:word" xmlns:w="http://schemas.openxmlformats.org/wordprocessingml/2006/main" xmlns:w14="http://schemas.microsoft.com/office/word/2010/wordml" xmlns:w15="http://schemas.microsoft.com/office/word/2012/wordml" xmlns:w16cex="http://schemas.microsoft.com/office/word/2018/wordml/cex" xmlns:w16cid="http://schemas.microsoft.com/office/word/2016/wordml/cid" xmlns:w16="http://schemas.microsoft.com/office/word/2018/wordml" xmlns:w16du="http://schemas.microsoft.com/office/word/2023/wordml/word16du" xmlns:w16sdtdh="http://schemas.microsoft.com/office/word/2020/wordml/sdtdatahash" xmlns:w16sdtfl="http://schemas.microsoft.com/office/word/2024/wordml/sdtformatlock" xmlns:w16se="http://schemas.microsoft.com/office/word/2015/wordml/symex" xmlns:wpg="http://schemas.microsoft.com/office/word/2010/wordprocessingGroup" xmlns:wpi="http://schemas.microsoft.com/office/word/2010/wordprocessingInk" xmlns:wne="http://schemas.microsoft.com/office/word/2006/wordml" xmlns:wps="http://schemas.microsoft.com/office/word/2010/wordprocessingShape" mc:Ignorable="w14 w15 w16se w16cid w16 w16cex w16sdtdh w16sdtfl w16du wp14">
   <w:body>
     <w:p>
       <w:pPr>
@@ -10,6 +10,7 @@
           <w:szCs w:val="24"/>
         </w:rPr>
       </w:pPr>
+      <w:proofErr w:type="gramStart"/>
       <w:r>
         <w:rPr>
           <w:rFonts w:ascii="Times New Roman" w:eastAsia="Times New Roman" w:hAnsi="Times New Roman" w:cs="Times New Roman"/>
@@ -28,8 +29,9 @@
           <w:sz w:val="24"/>
           <w:szCs w:val="24"/>
         </w:rPr>
-        <w:t xml:space="preserve">- </w:t>
-      </w:r>
+        <w:t>-</w:t>
+      </w:r>
+      <w:proofErr w:type="gramEnd"/>
       <w:r>
         <w:rPr>
           <w:rFonts w:ascii="Times New Roman" w:eastAsia="Times New Roman" w:hAnsi="Times New Roman" w:cs="Times New Roman"/>
@@ -43,10 +45,29 @@
       <w:r>
         <w:rPr>
           <w:rFonts w:ascii="Times New Roman" w:eastAsia="Times New Roman" w:hAnsi="Times New Roman" w:cs="Times New Roman"/>
-          <w:sz w:val="24"/>
-          <w:szCs w:val="24"/>
-        </w:rPr>
-        <w:t>${event</w:t>
+          <w:b/>
+          <w:bCs/>
+          <w:sz w:val="24"/>
+          <w:szCs w:val="24"/>
+        </w:rPr>
+        <w:t xml:space="preserve"> </w:t>
+      </w:r>
+      <w:r>
+        <w:rPr>
+          <w:rFonts w:ascii="Times New Roman" w:eastAsia="Times New Roman" w:hAnsi="Times New Roman" w:cs="Times New Roman"/>
+          <w:sz w:val="24"/>
+          <w:szCs w:val="24"/>
+        </w:rPr>
+        <w:t>${</w:t>
+      </w:r>
+      <w:proofErr w:type="spellStart"/>
+      <w:r>
+        <w:rPr>
+          <w:rFonts w:ascii="Times New Roman" w:eastAsia="Times New Roman" w:hAnsi="Times New Roman" w:cs="Times New Roman"/>
+          <w:sz w:val="24"/>
+          <w:szCs w:val="24"/>
+        </w:rPr>
+        <w:t>event</w:t>
       </w:r>
       <w:r>
         <w:rPr>
@@ -62,17 +83,27 @@
           <w:sz w:val="24"/>
           <w:szCs w:val="24"/>
         </w:rPr>
-        <w:t>ame}</w:t>
-      </w:r>
-    </w:p>
-    <w:p>
-      <w:pPr>
-        <w:rPr>
-          <w:rFonts w:ascii="Times New Roman" w:eastAsia="Times New Roman" w:hAnsi="Times New Roman" w:cs="Times New Roman"/>
-          <w:sz w:val="26"/>
-          <w:szCs w:val="26"/>
-        </w:rPr>
-      </w:pPr>
+        <w:t>ame</w:t>
+      </w:r>
+      <w:proofErr w:type="spellEnd"/>
+      <w:r>
+        <w:rPr>
+          <w:rFonts w:ascii="Times New Roman" w:eastAsia="Times New Roman" w:hAnsi="Times New Roman" w:cs="Times New Roman"/>
+          <w:sz w:val="24"/>
+          <w:szCs w:val="24"/>
+        </w:rPr>
+        <w:t>}</w:t>
+      </w:r>
+    </w:p>
+    <w:p>
+      <w:pPr>
+        <w:rPr>
+          <w:rFonts w:ascii="Times New Roman" w:eastAsia="Times New Roman" w:hAnsi="Times New Roman" w:cs="Times New Roman"/>
+          <w:sz w:val="26"/>
+          <w:szCs w:val="26"/>
+        </w:rPr>
+      </w:pPr>
+      <w:proofErr w:type="gramStart"/>
       <w:r>
         <w:rPr>
           <w:rFonts w:ascii="Times New Roman" w:eastAsia="Times New Roman" w:hAnsi="Times New Roman" w:cs="Times New Roman"/>
@@ -91,8 +122,9 @@
           <w:sz w:val="24"/>
           <w:szCs w:val="24"/>
         </w:rPr>
-        <w:t xml:space="preserve">- </w:t>
-      </w:r>
+        <w:t>-</w:t>
+      </w:r>
+      <w:proofErr w:type="gramEnd"/>
       <w:r>
         <w:rPr>
           <w:rFonts w:ascii="Times New Roman" w:eastAsia="Times New Roman" w:hAnsi="Times New Roman" w:cs="Times New Roman"/>
@@ -106,10 +138,29 @@
       <w:r>
         <w:rPr>
           <w:rFonts w:ascii="Times New Roman" w:eastAsia="Times New Roman" w:hAnsi="Times New Roman" w:cs="Times New Roman"/>
-          <w:sz w:val="24"/>
-          <w:szCs w:val="24"/>
-        </w:rPr>
-        <w:t>${event</w:t>
+          <w:b/>
+          <w:bCs/>
+          <w:sz w:val="24"/>
+          <w:szCs w:val="24"/>
+        </w:rPr>
+        <w:t xml:space="preserve"> </w:t>
+      </w:r>
+      <w:r>
+        <w:rPr>
+          <w:rFonts w:ascii="Times New Roman" w:eastAsia="Times New Roman" w:hAnsi="Times New Roman" w:cs="Times New Roman"/>
+          <w:sz w:val="24"/>
+          <w:szCs w:val="24"/>
+        </w:rPr>
+        <w:t>${</w:t>
+      </w:r>
+      <w:proofErr w:type="spellStart"/>
+      <w:r>
+        <w:rPr>
+          <w:rFonts w:ascii="Times New Roman" w:eastAsia="Times New Roman" w:hAnsi="Times New Roman" w:cs="Times New Roman"/>
+          <w:sz w:val="24"/>
+          <w:szCs w:val="24"/>
+        </w:rPr>
+        <w:t>event</w:t>
       </w:r>
       <w:r>
         <w:rPr>
@@ -127,6 +178,7 @@
         </w:rPr>
         <w:t>ate</w:t>
       </w:r>
+      <w:proofErr w:type="spellEnd"/>
       <w:r>
         <w:rPr>
           <w:rFonts w:ascii="Times New Roman" w:eastAsia="Times New Roman" w:hAnsi="Times New Roman" w:cs="Times New Roman"/>
@@ -153,15 +205,55 @@
           <w:sz w:val="26"/>
           <w:szCs w:val="26"/>
         </w:rPr>
-        <w:t xml:space="preserve">Name of Program Officer:- </w:t>
-      </w:r>
-      <w:r>
-        <w:rPr>
-          <w:rFonts w:ascii="Times New Roman" w:eastAsia="Times New Roman" w:hAnsi="Times New Roman" w:cs="Times New Roman"/>
-          <w:sz w:val="24"/>
-          <w:szCs w:val="24"/>
-        </w:rPr>
-        <w:t xml:space="preserve"> Dr. Sandip Kambale, Ms. Swapna Jagtap, Dr. Tipusultan Sayyad</w:t>
+        <w:t xml:space="preserve">Name of Program </w:t>
+      </w:r>
+      <w:proofErr w:type="gramStart"/>
+      <w:r>
+        <w:rPr>
+          <w:rFonts w:ascii="Times New Roman" w:eastAsia="Times New Roman" w:hAnsi="Times New Roman" w:cs="Times New Roman"/>
+          <w:b/>
+          <w:bCs/>
+          <w:sz w:val="26"/>
+          <w:szCs w:val="26"/>
+        </w:rPr>
+        <w:t>Officer:-</w:t>
+      </w:r>
+      <w:proofErr w:type="gramEnd"/>
+      <w:r>
+        <w:rPr>
+          <w:rFonts w:ascii="Times New Roman" w:eastAsia="Times New Roman" w:hAnsi="Times New Roman" w:cs="Times New Roman"/>
+          <w:b/>
+          <w:bCs/>
+          <w:sz w:val="26"/>
+          <w:szCs w:val="26"/>
+        </w:rPr>
+        <w:t xml:space="preserve"> </w:t>
+      </w:r>
+      <w:r>
+        <w:rPr>
+          <w:rFonts w:ascii="Times New Roman" w:eastAsia="Times New Roman" w:hAnsi="Times New Roman" w:cs="Times New Roman"/>
+          <w:sz w:val="24"/>
+          <w:szCs w:val="24"/>
+        </w:rPr>
+        <w:t xml:space="preserve"> Dr. Sandip Kambale, Ms. Swapna Jagtap, Dr. </w:t>
+      </w:r>
+      <w:proofErr w:type="spellStart"/>
+      <w:r>
+        <w:rPr>
+          <w:rFonts w:ascii="Times New Roman" w:eastAsia="Times New Roman" w:hAnsi="Times New Roman" w:cs="Times New Roman"/>
+          <w:sz w:val="24"/>
+          <w:szCs w:val="24"/>
+        </w:rPr>
+        <w:t>Tipusultan</w:t>
+      </w:r>
+      <w:proofErr w:type="spellEnd"/>
+      <w:r>
+        <w:rPr>
+          <w:rFonts w:ascii="Times New Roman" w:eastAsia="Times New Roman" w:hAnsi="Times New Roman" w:cs="Times New Roman"/>
+          <w:sz w:val="24"/>
+          <w:szCs w:val="24"/>
+        </w:rPr>
+        <w:t xml:space="preserve"> Sayyad</w:t>
       </w:r>
     </w:p>
     <w:p>
@@ -507,8 +599,6 @@
       <w:pPr>
         <w:rPr>
           <w:rFonts w:ascii="Times New Roman" w:eastAsia="Times New Roman" w:hAnsi="Times New Roman" w:cs="Times New Roman"/>
-          <w:b/>
-          <w:bCs/>
           <w:sz w:val="26"/>
           <w:szCs w:val="26"/>
         </w:rPr>
@@ -546,6 +636,17 @@
         </w:rPr>
         <w:br/>
       </w:r>
+    </w:p>
+    <w:p>
+      <w:pPr>
+        <w:rPr>
+          <w:rFonts w:ascii="Times New Roman" w:eastAsia="Times New Roman" w:hAnsi="Times New Roman" w:cs="Times New Roman"/>
+          <w:b/>
+          <w:bCs/>
+          <w:sz w:val="26"/>
+          <w:szCs w:val="26"/>
+        </w:rPr>
+      </w:pPr>
       <w:r>
         <w:rPr>
           <w:rFonts w:ascii="Times New Roman" w:eastAsia="Times New Roman" w:hAnsi="Times New Roman" w:cs="Times New Roman"/>
@@ -931,7 +1032,7 @@
 </file>
 
 <file path=word/endnotes.xml><?xml version="1.0" encoding="utf-8"?>
-<w:endnotes xmlns:wpc="http://schemas.microsoft.com/office/word/2010/wordprocessingCanvas" xmlns:cx="http://schemas.microsoft.com/office/drawing/2014/chartex" xmlns:cx1="http://schemas.microsoft.com/office/drawing/2015/9/8/chartex" xmlns:cx2="http://schemas.microsoft.com/office/drawing/2015/10/21/chartex" xmlns:cx3="http://schemas.microsoft.com/office/drawing/2016/5/9/chartex" xmlns:cx4="http://schemas.microsoft.com/office/drawing/2016/5/10/chartex" xmlns:cx5="http://schemas.microsoft.com/office/drawing/2016/5/11/chartex" xmlns:cx6="http://schemas.microsoft.com/office/drawing/2016/5/12/chartex" xmlns:cx7="http://schemas.microsoft.com/office/drawing/2016/5/13/chartex" xmlns:cx8="http://schemas.microsoft.com/office/drawing/2016/5/14/chartex" xmlns:mc="http://schemas.openxmlformats.org/markup-compatibility/2006" xmlns:aink="http://schemas.microsoft.com/office/drawing/2016/ink" xmlns:am3d="http://schemas.microsoft.com/office/drawing/2017/model3d" xmlns:o="urn:schemas-microsoft-com:office:office" xmlns:oel="http://schemas.microsoft.com/office/2019/extlst" xmlns:r="http://schemas.openxmlformats.org/officeDocument/2006/relationships" xmlns:m="http://schemas.openxmlformats.org/officeDocument/2006/math" xmlns:v="urn:schemas-microsoft-com:vml" xmlns:wp14="http://schemas.microsoft.com/office/word/2010/wordprocessingDrawing" xmlns:wp="http://schemas.openxmlformats.org/drawingml/2006/wordprocessingDrawing" xmlns:w10="urn:schemas-microsoft-com:office:word" xmlns:w="http://schemas.openxmlformats.org/wordprocessingml/2006/main" xmlns:w14="http://schemas.microsoft.com/office/word/2010/wordml" xmlns:w15="http://schemas.microsoft.com/office/word/2012/wordml" xmlns:w16cei="http://schemas.microsoft.com/office/word/2026/wordml/cei" xmlns:w16cex="http://schemas.microsoft.com/office/word/2018/wordml/cex" xmlns:w16cid="http://schemas.microsoft.com/office/word/2016/wordml/cid" xmlns:w16="http://schemas.microsoft.com/office/word/2018/wordml" xmlns:w16du="http://schemas.microsoft.com/office/word/2023/wordml/word16du" xmlns:w16sdtdh="http://schemas.microsoft.com/office/word/2020/wordml/sdtdatahash" xmlns:w16sdtfl="http://schemas.microsoft.com/office/word/2024/wordml/sdtformatlock" xmlns:w16se="http://schemas.microsoft.com/office/word/2015/wordml/symex" xmlns:wpg="http://schemas.microsoft.com/office/word/2010/wordprocessingGroup" xmlns:wpi="http://schemas.microsoft.com/office/word/2010/wordprocessingInk" xmlns:wne="http://schemas.microsoft.com/office/word/2006/wordml" xmlns:wps="http://schemas.microsoft.com/office/word/2010/wordprocessingShape" mc:Ignorable="w14 w15 w16se w16cid w16 w16cex w16sdtdh w16sdtfl w16du wp14">
+<w:endnotes xmlns:wpc="http://schemas.microsoft.com/office/word/2010/wordprocessingCanvas" xmlns:cx="http://schemas.microsoft.com/office/drawing/2014/chartex" xmlns:cx1="http://schemas.microsoft.com/office/drawing/2015/9/8/chartex" xmlns:cx2="http://schemas.microsoft.com/office/drawing/2015/10/21/chartex" xmlns:cx3="http://schemas.microsoft.com/office/drawing/2016/5/9/chartex" xmlns:cx4="http://schemas.microsoft.com/office/drawing/2016/5/10/chartex" xmlns:cx5="http://schemas.microsoft.com/office/drawing/2016/5/11/chartex" xmlns:cx6="http://schemas.microsoft.com/office/drawing/2016/5/12/chartex" xmlns:cx7="http://schemas.microsoft.com/office/drawing/2016/5/13/chartex" xmlns:cx8="http://schemas.microsoft.com/office/drawing/2016/5/14/chartex" xmlns:mc="http://schemas.openxmlformats.org/markup-compatibility/2006" xmlns:aink="http://schemas.microsoft.com/office/drawing/2016/ink" xmlns:am3d="http://schemas.microsoft.com/office/drawing/2017/model3d" xmlns:o="urn:schemas-microsoft-com:office:office" xmlns:oel="http://schemas.microsoft.com/office/2019/extlst" xmlns:r="http://schemas.openxmlformats.org/officeDocument/2006/relationships" xmlns:m="http://schemas.openxmlformats.org/officeDocument/2006/math" xmlns:v="urn:schemas-microsoft-com:vml" xmlns:wp14="http://schemas.microsoft.com/office/word/2010/wordprocessingDrawing" xmlns:wp="http://schemas.openxmlformats.org/drawingml/2006/wordprocessingDrawing" xmlns:w10="urn:schemas-microsoft-com:office:word" xmlns:w="http://schemas.openxmlformats.org/wordprocessingml/2006/main" xmlns:w14="http://schemas.microsoft.com/office/word/2010/wordml" xmlns:w15="http://schemas.microsoft.com/office/word/2012/wordml" xmlns:w16cex="http://schemas.microsoft.com/office/word/2018/wordml/cex" xmlns:w16cid="http://schemas.microsoft.com/office/word/2016/wordml/cid" xmlns:w16="http://schemas.microsoft.com/office/word/2018/wordml" xmlns:w16du="http://schemas.microsoft.com/office/word/2023/wordml/word16du" xmlns:w16sdtdh="http://schemas.microsoft.com/office/word/2020/wordml/sdtdatahash" xmlns:w16sdtfl="http://schemas.microsoft.com/office/word/2024/wordml/sdtformatlock" xmlns:w16se="http://schemas.microsoft.com/office/word/2015/wordml/symex" xmlns:wpg="http://schemas.microsoft.com/office/word/2010/wordprocessingGroup" xmlns:wpi="http://schemas.microsoft.com/office/word/2010/wordprocessingInk" xmlns:wne="http://schemas.microsoft.com/office/word/2006/wordml" xmlns:wps="http://schemas.microsoft.com/office/word/2010/wordprocessingShape" mc:Ignorable="w14 w15 w16se w16cid w16 w16cex w16sdtdh w16sdtfl w16du wp14">
   <w:endnote w:type="separator" w:id="-1">
     <w:p>
       <w:pPr>
@@ -956,7 +1057,7 @@
 </file>
 
 <file path=word/footer1.xml><?xml version="1.0" encoding="utf-8"?>
-<w:ftr xmlns:wpc="http://schemas.microsoft.com/office/word/2010/wordprocessingCanvas" xmlns:cx="http://schemas.microsoft.com/office/drawing/2014/chartex" xmlns:cx1="http://schemas.microsoft.com/office/drawing/2015/9/8/chartex" xmlns:cx2="http://schemas.microsoft.com/office/drawing/2015/10/21/chartex" xmlns:cx3="http://schemas.microsoft.com/office/drawing/2016/5/9/chartex" xmlns:cx4="http://schemas.microsoft.com/office/drawing/2016/5/10/chartex" xmlns:cx5="http://schemas.microsoft.com/office/drawing/2016/5/11/chartex" xmlns:cx6="http://schemas.microsoft.com/office/drawing/2016/5/12/chartex" xmlns:cx7="http://schemas.microsoft.com/office/drawing/2016/5/13/chartex" xmlns:cx8="http://schemas.microsoft.com/office/drawing/2016/5/14/chartex" xmlns:mc="http://schemas.openxmlformats.org/markup-compatibility/2006" xmlns:aink="http://schemas.microsoft.com/office/drawing/2016/ink" xmlns:am3d="http://schemas.microsoft.com/office/drawing/2017/model3d" xmlns:o="urn:schemas-microsoft-com:office:office" xmlns:oel="http://schemas.microsoft.com/office/2019/extlst" xmlns:r="http://schemas.openxmlformats.org/officeDocument/2006/relationships" xmlns:m="http://schemas.openxmlformats.org/officeDocument/2006/math" xmlns:v="urn:schemas-microsoft-com:vml" xmlns:wp14="http://schemas.microsoft.com/office/word/2010/wordprocessingDrawing" xmlns:wp="http://schemas.openxmlformats.org/drawingml/2006/wordprocessingDrawing" xmlns:w10="urn:schemas-microsoft-com:office:word" xmlns:w="http://schemas.openxmlformats.org/wordprocessingml/2006/main" xmlns:w14="http://schemas.microsoft.com/office/word/2010/wordml" xmlns:w15="http://schemas.microsoft.com/office/word/2012/wordml" xmlns:w16cei="http://schemas.microsoft.com/office/word/2026/wordml/cei" xmlns:w16cex="http://schemas.microsoft.com/office/word/2018/wordml/cex" xmlns:w16cid="http://schemas.microsoft.com/office/word/2016/wordml/cid" xmlns:w16="http://schemas.microsoft.com/office/word/2018/wordml" xmlns:w16du="http://schemas.microsoft.com/office/word/2023/wordml/word16du" xmlns:w16sdtdh="http://schemas.microsoft.com/office/word/2020/wordml/sdtdatahash" xmlns:w16sdtfl="http://schemas.microsoft.com/office/word/2024/wordml/sdtformatlock" xmlns:w16se="http://schemas.microsoft.com/office/word/2015/wordml/symex" xmlns:wpg="http://schemas.microsoft.com/office/word/2010/wordprocessingGroup" xmlns:wpi="http://schemas.microsoft.com/office/word/2010/wordprocessingInk" xmlns:wne="http://schemas.microsoft.com/office/word/2006/wordml" xmlns:wps="http://schemas.microsoft.com/office/word/2010/wordprocessingShape" mc:Ignorable="w14 w15 w16se w16cid w16 w16cex w16sdtdh w16sdtfl w16du wp14">
+<w:ftr xmlns:wpc="http://schemas.microsoft.com/office/word/2010/wordprocessingCanvas" xmlns:cx="http://schemas.microsoft.com/office/drawing/2014/chartex" xmlns:cx1="http://schemas.microsoft.com/office/drawing/2015/9/8/chartex" xmlns:cx2="http://schemas.microsoft.com/office/drawing/2015/10/21/chartex" xmlns:cx3="http://schemas.microsoft.com/office/drawing/2016/5/9/chartex" xmlns:cx4="http://schemas.microsoft.com/office/drawing/2016/5/10/chartex" xmlns:cx5="http://schemas.microsoft.com/office/drawing/2016/5/11/chartex" xmlns:cx6="http://schemas.microsoft.com/office/drawing/2016/5/12/chartex" xmlns:cx7="http://schemas.microsoft.com/office/drawing/2016/5/13/chartex" xmlns:cx8="http://schemas.microsoft.com/office/drawing/2016/5/14/chartex" xmlns:mc="http://schemas.openxmlformats.org/markup-compatibility/2006" xmlns:aink="http://schemas.microsoft.com/office/drawing/2016/ink" xmlns:am3d="http://schemas.microsoft.com/office/drawing/2017/model3d" xmlns:o="urn:schemas-microsoft-com:office:office" xmlns:oel="http://schemas.microsoft.com/office/2019/extlst" xmlns:r="http://schemas.openxmlformats.org/officeDocument/2006/relationships" xmlns:m="http://schemas.openxmlformats.org/officeDocument/2006/math" xmlns:v="urn:schemas-microsoft-com:vml" xmlns:wp14="http://schemas.microsoft.com/office/word/2010/wordprocessingDrawing" xmlns:wp="http://schemas.openxmlformats.org/drawingml/2006/wordprocessingDrawing" xmlns:w10="urn:schemas-microsoft-com:office:word" xmlns:w="http://schemas.openxmlformats.org/wordprocessingml/2006/main" xmlns:w14="http://schemas.microsoft.com/office/word/2010/wordml" xmlns:w15="http://schemas.microsoft.com/office/word/2012/wordml" xmlns:w16cex="http://schemas.microsoft.com/office/word/2018/wordml/cex" xmlns:w16cid="http://schemas.microsoft.com/office/word/2016/wordml/cid" xmlns:w16="http://schemas.microsoft.com/office/word/2018/wordml" xmlns:w16du="http://schemas.microsoft.com/office/word/2023/wordml/word16du" xmlns:w16sdtdh="http://schemas.microsoft.com/office/word/2020/wordml/sdtdatahash" xmlns:w16sdtfl="http://schemas.microsoft.com/office/word/2024/wordml/sdtformatlock" xmlns:w16se="http://schemas.microsoft.com/office/word/2015/wordml/symex" xmlns:wpg="http://schemas.microsoft.com/office/word/2010/wordprocessingGroup" xmlns:wpi="http://schemas.microsoft.com/office/word/2010/wordprocessingInk" xmlns:wne="http://schemas.microsoft.com/office/word/2006/wordml" xmlns:wps="http://schemas.microsoft.com/office/word/2010/wordprocessingShape" mc:Ignorable="w14 w15 w16se w16cid w16 w16cex w16sdtdh w16sdtfl w16du wp14">
   <w:p>
     <w:pPr>
       <w:pBdr>
@@ -1103,7 +1204,7 @@
 </file>
 
 <file path=word/footer2.xml><?xml version="1.0" encoding="utf-8"?>
-<w:ftr xmlns:wpc="http://schemas.microsoft.com/office/word/2010/wordprocessingCanvas" xmlns:cx="http://schemas.microsoft.com/office/drawing/2014/chartex" xmlns:cx1="http://schemas.microsoft.com/office/drawing/2015/9/8/chartex" xmlns:cx2="http://schemas.microsoft.com/office/drawing/2015/10/21/chartex" xmlns:cx3="http://schemas.microsoft.com/office/drawing/2016/5/9/chartex" xmlns:cx4="http://schemas.microsoft.com/office/drawing/2016/5/10/chartex" xmlns:cx5="http://schemas.microsoft.com/office/drawing/2016/5/11/chartex" xmlns:cx6="http://schemas.microsoft.com/office/drawing/2016/5/12/chartex" xmlns:cx7="http://schemas.microsoft.com/office/drawing/2016/5/13/chartex" xmlns:cx8="http://schemas.microsoft.com/office/drawing/2016/5/14/chartex" xmlns:mc="http://schemas.openxmlformats.org/markup-compatibility/2006" xmlns:aink="http://schemas.microsoft.com/office/drawing/2016/ink" xmlns:am3d="http://schemas.microsoft.com/office/drawing/2017/model3d" xmlns:o="urn:schemas-microsoft-com:office:office" xmlns:oel="http://schemas.microsoft.com/office/2019/extlst" xmlns:r="http://schemas.openxmlformats.org/officeDocument/2006/relationships" xmlns:m="http://schemas.openxmlformats.org/officeDocument/2006/math" xmlns:v="urn:schemas-microsoft-com:vml" xmlns:wp14="http://schemas.microsoft.com/office/word/2010/wordprocessingDrawing" xmlns:wp="http://schemas.openxmlformats.org/drawingml/2006/wordprocessingDrawing" xmlns:w10="urn:schemas-microsoft-com:office:word" xmlns:w="http://schemas.openxmlformats.org/wordprocessingml/2006/main" xmlns:w14="http://schemas.microsoft.com/office/word/2010/wordml" xmlns:w15="http://schemas.microsoft.com/office/word/2012/wordml" xmlns:w16cei="http://schemas.microsoft.com/office/word/2026/wordml/cei" xmlns:w16cex="http://schemas.microsoft.com/office/word/2018/wordml/cex" xmlns:w16cid="http://schemas.microsoft.com/office/word/2016/wordml/cid" xmlns:w16="http://schemas.microsoft.com/office/word/2018/wordml" xmlns:w16du="http://schemas.microsoft.com/office/word/2023/wordml/word16du" xmlns:w16sdtdh="http://schemas.microsoft.com/office/word/2020/wordml/sdtdatahash" xmlns:w16sdtfl="http://schemas.microsoft.com/office/word/2024/wordml/sdtformatlock" xmlns:w16se="http://schemas.microsoft.com/office/word/2015/wordml/symex" xmlns:wpg="http://schemas.microsoft.com/office/word/2010/wordprocessingGroup" xmlns:wpi="http://schemas.microsoft.com/office/word/2010/wordprocessingInk" xmlns:wne="http://schemas.microsoft.com/office/word/2006/wordml" xmlns:wps="http://schemas.microsoft.com/office/word/2010/wordprocessingShape" mc:Ignorable="w14 w15 w16se w16cid w16 w16cex w16sdtdh w16sdtfl w16du wp14">
+<w:ftr xmlns:wpc="http://schemas.microsoft.com/office/word/2010/wordprocessingCanvas" xmlns:cx="http://schemas.microsoft.com/office/drawing/2014/chartex" xmlns:cx1="http://schemas.microsoft.com/office/drawing/2015/9/8/chartex" xmlns:cx2="http://schemas.microsoft.com/office/drawing/2015/10/21/chartex" xmlns:cx3="http://schemas.microsoft.com/office/drawing/2016/5/9/chartex" xmlns:cx4="http://schemas.microsoft.com/office/drawing/2016/5/10/chartex" xmlns:cx5="http://schemas.microsoft.com/office/drawing/2016/5/11/chartex" xmlns:cx6="http://schemas.microsoft.com/office/drawing/2016/5/12/chartex" xmlns:cx7="http://schemas.microsoft.com/office/drawing/2016/5/13/chartex" xmlns:cx8="http://schemas.microsoft.com/office/drawing/2016/5/14/chartex" xmlns:mc="http://schemas.openxmlformats.org/markup-compatibility/2006" xmlns:aink="http://schemas.microsoft.com/office/drawing/2016/ink" xmlns:am3d="http://schemas.microsoft.com/office/drawing/2017/model3d" xmlns:o="urn:schemas-microsoft-com:office:office" xmlns:oel="http://schemas.microsoft.com/office/2019/extlst" xmlns:r="http://schemas.openxmlformats.org/officeDocument/2006/relationships" xmlns:m="http://schemas.openxmlformats.org/officeDocument/2006/math" xmlns:v="urn:schemas-microsoft-com:vml" xmlns:wp14="http://schemas.microsoft.com/office/word/2010/wordprocessingDrawing" xmlns:wp="http://schemas.openxmlformats.org/drawingml/2006/wordprocessingDrawing" xmlns:w10="urn:schemas-microsoft-com:office:word" xmlns:w="http://schemas.openxmlformats.org/wordprocessingml/2006/main" xmlns:w14="http://schemas.microsoft.com/office/word/2010/wordml" xmlns:w15="http://schemas.microsoft.com/office/word/2012/wordml" xmlns:w16cex="http://schemas.microsoft.com/office/word/2018/wordml/cex" xmlns:w16cid="http://schemas.microsoft.com/office/word/2016/wordml/cid" xmlns:w16="http://schemas.microsoft.com/office/word/2018/wordml" xmlns:w16du="http://schemas.microsoft.com/office/word/2023/wordml/word16du" xmlns:w16sdtdh="http://schemas.microsoft.com/office/word/2020/wordml/sdtdatahash" xmlns:w16sdtfl="http://schemas.microsoft.com/office/word/2024/wordml/sdtformatlock" xmlns:w16se="http://schemas.microsoft.com/office/word/2015/wordml/symex" xmlns:wpg="http://schemas.microsoft.com/office/word/2010/wordprocessingGroup" xmlns:wpi="http://schemas.microsoft.com/office/word/2010/wordprocessingInk" xmlns:wne="http://schemas.microsoft.com/office/word/2006/wordml" xmlns:wps="http://schemas.microsoft.com/office/word/2010/wordprocessingShape" mc:Ignorable="w14 w15 w16se w16cid w16 w16cex w16sdtdh w16sdtfl w16du wp14">
   <w:p>
     <w:pPr>
       <w:pStyle w:val="Footer"/>
@@ -1128,7 +1229,7 @@
 </file>
 
 <file path=word/footnotes.xml><?xml version="1.0" encoding="utf-8"?>
-<w:footnotes xmlns:wpc="http://schemas.microsoft.com/office/word/2010/wordprocessingCanvas" xmlns:cx="http://schemas.microsoft.com/office/drawing/2014/chartex" xmlns:cx1="http://schemas.microsoft.com/office/drawing/2015/9/8/chartex" xmlns:cx2="http://schemas.microsoft.com/office/drawing/2015/10/21/chartex" xmlns:cx3="http://schemas.microsoft.com/office/drawing/2016/5/9/chartex" xmlns:cx4="http://schemas.microsoft.com/office/drawing/2016/5/10/chartex" xmlns:cx5="http://schemas.microsoft.com/office/drawing/2016/5/11/chartex" xmlns:cx6="http://schemas.microsoft.com/office/drawing/2016/5/12/chartex" xmlns:cx7="http://schemas.microsoft.com/office/drawing/2016/5/13/chartex" xmlns:cx8="http://schemas.microsoft.com/office/drawing/2016/5/14/chartex" xmlns:mc="http://schemas.openxmlformats.org/markup-compatibility/2006" xmlns:aink="http://schemas.microsoft.com/office/drawing/2016/ink" xmlns:am3d="http://schemas.microsoft.com/office/drawing/2017/model3d" xmlns:o="urn:schemas-microsoft-com:office:office" xmlns:oel="http://schemas.microsoft.com/office/2019/extlst" xmlns:r="http://schemas.openxmlformats.org/officeDocument/2006/relationships" xmlns:m="http://schemas.openxmlformats.org/officeDocument/2006/math" xmlns:v="urn:schemas-microsoft-com:vml" xmlns:wp14="http://schemas.microsoft.com/office/word/2010/wordprocessingDrawing" xmlns:wp="http://schemas.openxmlformats.org/drawingml/2006/wordprocessingDrawing" xmlns:w10="urn:schemas-microsoft-com:office:word" xmlns:w="http://schemas.openxmlformats.org/wordprocessingml/2006/main" xmlns:w14="http://schemas.microsoft.com/office/word/2010/wordml" xmlns:w15="http://schemas.microsoft.com/office/word/2012/wordml" xmlns:w16cei="http://schemas.microsoft.com/office/word/2026/wordml/cei" xmlns:w16cex="http://schemas.microsoft.com/office/word/2018/wordml/cex" xmlns:w16cid="http://schemas.microsoft.com/office/word/2016/wordml/cid" xmlns:w16="http://schemas.microsoft.com/office/word/2018/wordml" xmlns:w16du="http://schemas.microsoft.com/office/word/2023/wordml/word16du" xmlns:w16sdtdh="http://schemas.microsoft.com/office/word/2020/wordml/sdtdatahash" xmlns:w16sdtfl="http://schemas.microsoft.com/office/word/2024/wordml/sdtformatlock" xmlns:w16se="http://schemas.microsoft.com/office/word/2015/wordml/symex" xmlns:wpg="http://schemas.microsoft.com/office/word/2010/wordprocessingGroup" xmlns:wpi="http://schemas.microsoft.com/office/word/2010/wordprocessingInk" xmlns:wne="http://schemas.microsoft.com/office/word/2006/wordml" xmlns:wps="http://schemas.microsoft.com/office/word/2010/wordprocessingShape" mc:Ignorable="w14 w15 w16se w16cid w16 w16cex w16sdtdh w16sdtfl w16du wp14">
+<w:footnotes xmlns:wpc="http://schemas.microsoft.com/office/word/2010/wordprocessingCanvas" xmlns:cx="http://schemas.microsoft.com/office/drawing/2014/chartex" xmlns:cx1="http://schemas.microsoft.com/office/drawing/2015/9/8/chartex" xmlns:cx2="http://schemas.microsoft.com/office/drawing/2015/10/21/chartex" xmlns:cx3="http://schemas.microsoft.com/office/drawing/2016/5/9/chartex" xmlns:cx4="http://schemas.microsoft.com/office/drawing/2016/5/10/chartex" xmlns:cx5="http://schemas.microsoft.com/office/drawing/2016/5/11/chartex" xmlns:cx6="http://schemas.microsoft.com/office/drawing/2016/5/12/chartex" xmlns:cx7="http://schemas.microsoft.com/office/drawing/2016/5/13/chartex" xmlns:cx8="http://schemas.microsoft.com/office/drawing/2016/5/14/chartex" xmlns:mc="http://schemas.openxmlformats.org/markup-compatibility/2006" xmlns:aink="http://schemas.microsoft.com/office/drawing/2016/ink" xmlns:am3d="http://schemas.microsoft.com/office/drawing/2017/model3d" xmlns:o="urn:schemas-microsoft-com:office:office" xmlns:oel="http://schemas.microsoft.com/office/2019/extlst" xmlns:r="http://schemas.openxmlformats.org/officeDocument/2006/relationships" xmlns:m="http://schemas.openxmlformats.org/officeDocument/2006/math" xmlns:v="urn:schemas-microsoft-com:vml" xmlns:wp14="http://schemas.microsoft.com/office/word/2010/wordprocessingDrawing" xmlns:wp="http://schemas.openxmlformats.org/drawingml/2006/wordprocessingDrawing" xmlns:w10="urn:schemas-microsoft-com:office:word" xmlns:w="http://schemas.openxmlformats.org/wordprocessingml/2006/main" xmlns:w14="http://schemas.microsoft.com/office/word/2010/wordml" xmlns:w15="http://schemas.microsoft.com/office/word/2012/wordml" xmlns:w16cex="http://schemas.microsoft.com/office/word/2018/wordml/cex" xmlns:w16cid="http://schemas.microsoft.com/office/word/2016/wordml/cid" xmlns:w16="http://schemas.microsoft.com/office/word/2018/wordml" xmlns:w16du="http://schemas.microsoft.com/office/word/2023/wordml/word16du" xmlns:w16sdtdh="http://schemas.microsoft.com/office/word/2020/wordml/sdtdatahash" xmlns:w16sdtfl="http://schemas.microsoft.com/office/word/2024/wordml/sdtformatlock" xmlns:w16se="http://schemas.microsoft.com/office/word/2015/wordml/symex" xmlns:wpg="http://schemas.microsoft.com/office/word/2010/wordprocessingGroup" xmlns:wpi="http://schemas.microsoft.com/office/word/2010/wordprocessingInk" xmlns:wne="http://schemas.microsoft.com/office/word/2006/wordml" xmlns:wps="http://schemas.microsoft.com/office/word/2010/wordprocessingShape" mc:Ignorable="w14 w15 w16se w16cid w16 w16cex w16sdtdh w16sdtfl w16du wp14">
   <w:footnote w:type="separator" w:id="-1">
     <w:p>
       <w:pPr>
@@ -1153,7 +1254,7 @@
 </file>
 
 <file path=word/header1.xml><?xml version="1.0" encoding="utf-8"?>
-<w:hdr xmlns:wpc="http://schemas.microsoft.com/office/word/2010/wordprocessingCanvas" xmlns:cx="http://schemas.microsoft.com/office/drawing/2014/chartex" xmlns:cx1="http://schemas.microsoft.com/office/drawing/2015/9/8/chartex" xmlns:cx2="http://schemas.microsoft.com/office/drawing/2015/10/21/chartex" xmlns:cx3="http://schemas.microsoft.com/office/drawing/2016/5/9/chartex" xmlns:cx4="http://schemas.microsoft.com/office/drawing/2016/5/10/chartex" xmlns:cx5="http://schemas.microsoft.com/office/drawing/2016/5/11/chartex" xmlns:cx6="http://schemas.microsoft.com/office/drawing/2016/5/12/chartex" xmlns:cx7="http://schemas.microsoft.com/office/drawing/2016/5/13/chartex" xmlns:cx8="http://schemas.microsoft.com/office/drawing/2016/5/14/chartex" xmlns:mc="http://schemas.openxmlformats.org/markup-compatibility/2006" xmlns:aink="http://schemas.microsoft.com/office/drawing/2016/ink" xmlns:am3d="http://schemas.microsoft.com/office/drawing/2017/model3d" xmlns:o="urn:schemas-microsoft-com:office:office" xmlns:oel="http://schemas.microsoft.com/office/2019/extlst" xmlns:r="http://schemas.openxmlformats.org/officeDocument/2006/relationships" xmlns:m="http://schemas.openxmlformats.org/officeDocument/2006/math" xmlns:v="urn:schemas-microsoft-com:vml" xmlns:wp14="http://schemas.microsoft.com/office/word/2010/wordprocessingDrawing" xmlns:wp="http://schemas.openxmlformats.org/drawingml/2006/wordprocessingDrawing" xmlns:w10="urn:schemas-microsoft-com:office:word" xmlns:w="http://schemas.openxmlformats.org/wordprocessingml/2006/main" xmlns:w14="http://schemas.microsoft.com/office/word/2010/wordml" xmlns:w15="http://schemas.microsoft.com/office/word/2012/wordml" xmlns:w16cei="http://schemas.microsoft.com/office/word/2026/wordml/cei" xmlns:w16cex="http://schemas.microsoft.com/office/word/2018/wordml/cex" xmlns:w16cid="http://schemas.microsoft.com/office/word/2016/wordml/cid" xmlns:w16="http://schemas.microsoft.com/office/word/2018/wordml" xmlns:w16du="http://schemas.microsoft.com/office/word/2023/wordml/word16du" xmlns:w16sdtdh="http://schemas.microsoft.com/office/word/2020/wordml/sdtdatahash" xmlns:w16sdtfl="http://schemas.microsoft.com/office/word/2024/wordml/sdtformatlock" xmlns:w16se="http://schemas.microsoft.com/office/word/2015/wordml/symex" xmlns:wpg="http://schemas.microsoft.com/office/word/2010/wordprocessingGroup" xmlns:wpi="http://schemas.microsoft.com/office/word/2010/wordprocessingInk" xmlns:wne="http://schemas.microsoft.com/office/word/2006/wordml" xmlns:wps="http://schemas.microsoft.com/office/word/2010/wordprocessingShape" mc:Ignorable="w14 w15 w16se w16cid w16 w16cex w16sdtdh w16sdtfl w16du wp14">
+<w:hdr xmlns:wpc="http://schemas.microsoft.com/office/word/2010/wordprocessingCanvas" xmlns:cx="http://schemas.microsoft.com/office/drawing/2014/chartex" xmlns:cx1="http://schemas.microsoft.com/office/drawing/2015/9/8/chartex" xmlns:cx2="http://schemas.microsoft.com/office/drawing/2015/10/21/chartex" xmlns:cx3="http://schemas.microsoft.com/office/drawing/2016/5/9/chartex" xmlns:cx4="http://schemas.microsoft.com/office/drawing/2016/5/10/chartex" xmlns:cx5="http://schemas.microsoft.com/office/drawing/2016/5/11/chartex" xmlns:cx6="http://schemas.microsoft.com/office/drawing/2016/5/12/chartex" xmlns:cx7="http://schemas.microsoft.com/office/drawing/2016/5/13/chartex" xmlns:cx8="http://schemas.microsoft.com/office/drawing/2016/5/14/chartex" xmlns:mc="http://schemas.openxmlformats.org/markup-compatibility/2006" xmlns:aink="http://schemas.microsoft.com/office/drawing/2016/ink" xmlns:am3d="http://schemas.microsoft.com/office/drawing/2017/model3d" xmlns:o="urn:schemas-microsoft-com:office:office" xmlns:oel="http://schemas.microsoft.com/office/2019/extlst" xmlns:r="http://schemas.openxmlformats.org/officeDocument/2006/relationships" xmlns:m="http://schemas.openxmlformats.org/officeDocument/2006/math" xmlns:v="urn:schemas-microsoft-com:vml" xmlns:wp14="http://schemas.microsoft.com/office/word/2010/wordprocessingDrawing" xmlns:wp="http://schemas.openxmlformats.org/drawingml/2006/wordprocessingDrawing" xmlns:w10="urn:schemas-microsoft-com:office:word" xmlns:w="http://schemas.openxmlformats.org/wordprocessingml/2006/main" xmlns:w14="http://schemas.microsoft.com/office/word/2010/wordml" xmlns:w15="http://schemas.microsoft.com/office/word/2012/wordml" xmlns:w16cex="http://schemas.microsoft.com/office/word/2018/wordml/cex" xmlns:w16cid="http://schemas.microsoft.com/office/word/2016/wordml/cid" xmlns:w16="http://schemas.microsoft.com/office/word/2018/wordml" xmlns:w16du="http://schemas.microsoft.com/office/word/2023/wordml/word16du" xmlns:w16sdtdh="http://schemas.microsoft.com/office/word/2020/wordml/sdtdatahash" xmlns:w16sdtfl="http://schemas.microsoft.com/office/word/2024/wordml/sdtformatlock" xmlns:w16se="http://schemas.microsoft.com/office/word/2015/wordml/symex" xmlns:wpg="http://schemas.microsoft.com/office/word/2010/wordprocessingGroup" xmlns:wpi="http://schemas.microsoft.com/office/word/2010/wordprocessingInk" xmlns:wne="http://schemas.microsoft.com/office/word/2006/wordml" xmlns:wps="http://schemas.microsoft.com/office/word/2010/wordprocessingShape" mc:Ignorable="w14 w15 w16se w16cid w16 w16cex w16sdtdh w16sdtfl w16du wp14">
   <w:p>
     <w:pPr>
       <w:spacing w:line="240" w:lineRule="auto"/>
@@ -1454,7 +1555,7 @@
 </file>
 
 <file path=word/numbering.xml><?xml version="1.0" encoding="utf-8"?>
-<w:numbering xmlns:wpc="http://schemas.microsoft.com/office/word/2010/wordprocessingCanvas" xmlns:cx="http://schemas.microsoft.com/office/drawing/2014/chartex" xmlns:cx1="http://schemas.microsoft.com/office/drawing/2015/9/8/chartex" xmlns:cx2="http://schemas.microsoft.com/office/drawing/2015/10/21/chartex" xmlns:cx3="http://schemas.microsoft.com/office/drawing/2016/5/9/chartex" xmlns:cx4="http://schemas.microsoft.com/office/drawing/2016/5/10/chartex" xmlns:cx5="http://schemas.microsoft.com/office/drawing/2016/5/11/chartex" xmlns:cx6="http://schemas.microsoft.com/office/drawing/2016/5/12/chartex" xmlns:cx7="http://schemas.microsoft.com/office/drawing/2016/5/13/chartex" xmlns:cx8="http://schemas.microsoft.com/office/drawing/2016/5/14/chartex" xmlns:mc="http://schemas.openxmlformats.org/markup-compatibility/2006" xmlns:aink="http://schemas.microsoft.com/office/drawing/2016/ink" xmlns:am3d="http://schemas.microsoft.com/office/drawing/2017/model3d" xmlns:o="urn:schemas-microsoft-com:office:office" xmlns:oel="http://schemas.microsoft.com/office/2019/extlst" xmlns:r="http://schemas.openxmlformats.org/officeDocument/2006/relationships" xmlns:m="http://schemas.openxmlformats.org/officeDocument/2006/math" xmlns:v="urn:schemas-microsoft-com:vml" xmlns:wp14="http://schemas.microsoft.com/office/word/2010/wordprocessingDrawing" xmlns:wp="http://schemas.openxmlformats.org/drawingml/2006/wordprocessingDrawing" xmlns:w10="urn:schemas-microsoft-com:office:word" xmlns:w="http://schemas.openxmlformats.org/wordprocessingml/2006/main" xmlns:w14="http://schemas.microsoft.com/office/word/2010/wordml" xmlns:w15="http://schemas.microsoft.com/office/word/2012/wordml" xmlns:w16cei="http://schemas.microsoft.com/office/word/2026/wordml/cei" xmlns:w16cex="http://schemas.microsoft.com/office/word/2018/wordml/cex" xmlns:w16cid="http://schemas.microsoft.com/office/word/2016/wordml/cid" xmlns:w16="http://schemas.microsoft.com/office/word/2018/wordml" xmlns:w16du="http://schemas.microsoft.com/office/word/2023/wordml/word16du" xmlns:w16sdtdh="http://schemas.microsoft.com/office/word/2020/wordml/sdtdatahash" xmlns:w16sdtfl="http://schemas.microsoft.com/office/word/2024/wordml/sdtformatlock" xmlns:w16se="http://schemas.microsoft.com/office/word/2015/wordml/symex" xmlns:wpg="http://schemas.microsoft.com/office/word/2010/wordprocessingGroup" xmlns:wpi="http://schemas.microsoft.com/office/word/2010/wordprocessingInk" xmlns:wne="http://schemas.microsoft.com/office/word/2006/wordml" xmlns:wps="http://schemas.microsoft.com/office/word/2010/wordprocessingShape" mc:Ignorable="w14 w15 w16se w16cid w16 w16cex w16sdtdh w16sdtfl w16du wp14">
+<w:numbering xmlns:wpc="http://schemas.microsoft.com/office/word/2010/wordprocessingCanvas" xmlns:cx="http://schemas.microsoft.com/office/drawing/2014/chartex" xmlns:cx1="http://schemas.microsoft.com/office/drawing/2015/9/8/chartex" xmlns:cx2="http://schemas.microsoft.com/office/drawing/2015/10/21/chartex" xmlns:cx3="http://schemas.microsoft.com/office/drawing/2016/5/9/chartex" xmlns:cx4="http://schemas.microsoft.com/office/drawing/2016/5/10/chartex" xmlns:cx5="http://schemas.microsoft.com/office/drawing/2016/5/11/chartex" xmlns:cx6="http://schemas.microsoft.com/office/drawing/2016/5/12/chartex" xmlns:cx7="http://schemas.microsoft.com/office/drawing/2016/5/13/chartex" xmlns:cx8="http://schemas.microsoft.com/office/drawing/2016/5/14/chartex" xmlns:mc="http://schemas.openxmlformats.org/markup-compatibility/2006" xmlns:aink="http://schemas.microsoft.com/office/drawing/2016/ink" xmlns:am3d="http://schemas.microsoft.com/office/drawing/2017/model3d" xmlns:o="urn:schemas-microsoft-com:office:office" xmlns:oel="http://schemas.microsoft.com/office/2019/extlst" xmlns:r="http://schemas.openxmlformats.org/officeDocument/2006/relationships" xmlns:m="http://schemas.openxmlformats.org/officeDocument/2006/math" xmlns:v="urn:schemas-microsoft-com:vml" xmlns:wp14="http://schemas.microsoft.com/office/word/2010/wordprocessingDrawing" xmlns:wp="http://schemas.openxmlformats.org/drawingml/2006/wordprocessingDrawing" xmlns:w10="urn:schemas-microsoft-com:office:word" xmlns:w="http://schemas.openxmlformats.org/wordprocessingml/2006/main" xmlns:w14="http://schemas.microsoft.com/office/word/2010/wordml" xmlns:w15="http://schemas.microsoft.com/office/word/2012/wordml" xmlns:w16cex="http://schemas.microsoft.com/office/word/2018/wordml/cex" xmlns:w16cid="http://schemas.microsoft.com/office/word/2016/wordml/cid" xmlns:w16="http://schemas.microsoft.com/office/word/2018/wordml" xmlns:w16du="http://schemas.microsoft.com/office/word/2023/wordml/word16du" xmlns:w16sdtdh="http://schemas.microsoft.com/office/word/2020/wordml/sdtdatahash" xmlns:w16sdtfl="http://schemas.microsoft.com/office/word/2024/wordml/sdtformatlock" xmlns:w16se="http://schemas.microsoft.com/office/word/2015/wordml/symex" xmlns:wpg="http://schemas.microsoft.com/office/word/2010/wordprocessingGroup" xmlns:wpi="http://schemas.microsoft.com/office/word/2010/wordprocessingInk" xmlns:wne="http://schemas.microsoft.com/office/word/2006/wordml" xmlns:wps="http://schemas.microsoft.com/office/word/2010/wordprocessingShape" mc:Ignorable="w14 w15 w16se w16cid w16 w16cex w16sdtdh w16sdtfl w16du wp14">
   <w:abstractNum w:abstractNumId="0" w15:restartNumberingAfterBreak="0">
     <w:nsid w:val="64543BC6"/>
     <w:multiLevelType w:val="hybridMultilevel"/>

</xml_diff>